<commit_message>
thêm phần giao diện chat và chỉnh sửa docx
</commit_message>
<xml_diff>
--- a/DOCX/BÁO CÁO DỰ ÁN.docx
+++ b/DOCX/BÁO CÁO DỰ ÁN.docx
@@ -1466,133 +1466,41 @@
         <w:keepLines w:val="0"/>
         <w:widowControl/>
         <w:suppressLineNumbers w:val="0"/>
-        <w:rPr>
-          <w:rFonts w:hint="default" w:ascii="Times New Roman" w:hAnsi="Times New Roman" w:cs="Times New Roman"/>
-          <w:b w:val="0"/>
-          <w:bCs w:val="0"/>
-          <w:sz w:val="26"/>
-          <w:szCs w:val="26"/>
-        </w:rPr>
-      </w:pPr>
-      <w:r>
-        <w:rPr>
-          <w:rFonts w:hint="default" w:ascii="Times New Roman" w:hAnsi="Times New Roman" w:cs="Times New Roman"/>
-          <w:b w:val="0"/>
-          <w:bCs w:val="0"/>
-          <w:sz w:val="26"/>
-          <w:szCs w:val="26"/>
-        </w:rPr>
-        <w:t>LỜI MỞ ĐẦU</w:t>
-      </w:r>
-    </w:p>
-    <w:p>
-      <w:pPr>
-        <w:pStyle w:val="3"/>
-        <w:keepNext w:val="0"/>
-        <w:keepLines w:val="0"/>
-        <w:widowControl/>
-        <w:suppressLineNumbers w:val="0"/>
-        <w:rPr>
-          <w:rFonts w:hint="default" w:ascii="Times New Roman" w:hAnsi="Times New Roman" w:cs="Times New Roman"/>
-          <w:b w:val="0"/>
-          <w:bCs w:val="0"/>
-          <w:sz w:val="26"/>
-          <w:szCs w:val="26"/>
-        </w:rPr>
-      </w:pPr>
-      <w:r>
-        <w:rPr>
-          <w:rFonts w:hint="default" w:ascii="Times New Roman" w:hAnsi="Times New Roman" w:cs="Times New Roman"/>
-          <w:b w:val="0"/>
-          <w:bCs w:val="0"/>
-          <w:sz w:val="26"/>
-          <w:szCs w:val="26"/>
-        </w:rPr>
-        <w:t>1. Lý do chọn đề tài</w:t>
-      </w:r>
-    </w:p>
-    <w:p>
-      <w:pPr>
-        <w:pStyle w:val="10"/>
-        <w:keepNext w:val="0"/>
-        <w:keepLines w:val="0"/>
-        <w:widowControl/>
-        <w:suppressLineNumbers w:val="0"/>
-        <w:rPr>
-          <w:rFonts w:hint="default" w:ascii="Times New Roman" w:hAnsi="Times New Roman" w:cs="Times New Roman"/>
-          <w:sz w:val="26"/>
-          <w:szCs w:val="26"/>
-        </w:rPr>
-      </w:pPr>
-      <w:r>
-        <w:rPr>
-          <w:rFonts w:hint="default" w:ascii="Times New Roman" w:hAnsi="Times New Roman" w:cs="Times New Roman"/>
-          <w:sz w:val="26"/>
-          <w:szCs w:val="26"/>
-        </w:rPr>
-        <w:t xml:space="preserve">Trong kỷ nguyên số, nhu cầu giao tiếp thời gian thực (real-time) như các ứng dụng nhắn tin ngày càng trở nên thiết yếu. Để xây dựng các hệ thống này, giao thức </w:t>
-      </w:r>
-      <w:r>
+        <w:jc w:val="center"/>
         <w:rPr>
           <w:rFonts w:hint="default" w:ascii="Times New Roman" w:hAnsi="Times New Roman" w:cs="Times New Roman"/>
           <w:b/>
           <w:bCs/>
-          <w:sz w:val="26"/>
-          <w:szCs w:val="26"/>
-        </w:rPr>
-        <w:t>TCP (Transmission Control Protocol)</w:t>
-      </w:r>
-      <w:r>
-        <w:rPr>
-          <w:rFonts w:hint="default" w:ascii="Times New Roman" w:hAnsi="Times New Roman" w:cs="Times New Roman"/>
-          <w:sz w:val="26"/>
-          <w:szCs w:val="26"/>
-        </w:rPr>
-        <w:t xml:space="preserve"> là lựa chọn hàng đầu nhờ đặc tính hướng kết nối, đảm bảo dữ liệu được truyền tải một cách tin cậy, chính xác và không bị mất mát.</w:t>
-      </w:r>
-    </w:p>
-    <w:p>
-      <w:pPr>
-        <w:pStyle w:val="10"/>
-        <w:keepNext w:val="0"/>
-        <w:keepLines w:val="0"/>
-        <w:widowControl/>
-        <w:suppressLineNumbers w:val="0"/>
-        <w:rPr>
-          <w:rFonts w:hint="default" w:ascii="Times New Roman" w:hAnsi="Times New Roman" w:cs="Times New Roman"/>
-          <w:sz w:val="26"/>
-          <w:szCs w:val="26"/>
-        </w:rPr>
-      </w:pPr>
-      <w:r>
-        <w:rPr>
-          <w:rFonts w:hint="default" w:ascii="Times New Roman" w:hAnsi="Times New Roman" w:cs="Times New Roman"/>
-          <w:sz w:val="26"/>
-          <w:szCs w:val="26"/>
-        </w:rPr>
-        <w:t xml:space="preserve">Môn học Lập trình mạng cung cấp các lý thuyết nền tảng về Socket và kiến trúc Client-Server. Nhằm mục đích chuyển hóa các lý thuyết này thành thực tế, đồng thời giải quyết bài toán xử lý đa luồng (Multi-threading) khi có nhiều người dùng kết nối cùng lúc, em/nhóm em đã quyết định thực hiện đề tài: </w:t>
-      </w:r>
+          <w:sz w:val="30"/>
+          <w:szCs w:val="30"/>
+        </w:rPr>
+      </w:pPr>
       <w:r>
         <w:rPr>
           <w:rFonts w:hint="default" w:ascii="Times New Roman" w:hAnsi="Times New Roman" w:cs="Times New Roman"/>
           <w:b/>
           <w:bCs/>
-          <w:sz w:val="26"/>
-          <w:szCs w:val="26"/>
-        </w:rPr>
-        <w:t>"</w:t>
-      </w:r>
-      <w:r>
+          <w:sz w:val="30"/>
+          <w:szCs w:val="30"/>
+        </w:rPr>
+        <w:t>LỜI MỞ ĐẦU</w:t>
+      </w:r>
+    </w:p>
+    <w:p>
+      <w:pPr>
+        <w:pStyle w:val="3"/>
+        <w:keepNext w:val="0"/>
+        <w:keepLines w:val="0"/>
+        <w:widowControl/>
+        <w:suppressLineNumbers w:val="0"/>
         <w:rPr>
           <w:rFonts w:hint="default" w:ascii="Times New Roman" w:hAnsi="Times New Roman" w:cs="Times New Roman"/>
           <w:b/>
           <w:bCs/>
           <w:sz w:val="26"/>
           <w:szCs w:val="26"/>
-          <w:lang w:val="en-US"/>
-        </w:rPr>
-        <w:t>Lập trình</w:t>
-      </w:r>
+        </w:rPr>
+      </w:pPr>
       <w:r>
         <w:rPr>
           <w:rFonts w:hint="default" w:ascii="Times New Roman" w:hAnsi="Times New Roman" w:cs="Times New Roman"/>
@@ -1601,15 +1509,102 @@
           <w:sz w:val="26"/>
           <w:szCs w:val="26"/>
         </w:rPr>
-        <w:t xml:space="preserve"> ứng dụng chat qua giao thức TCP"</w:t>
-      </w:r>
-      <w:r>
-        <w:rPr>
-          <w:rFonts w:hint="default" w:ascii="Times New Roman" w:hAnsi="Times New Roman" w:cs="Times New Roman"/>
-          <w:sz w:val="26"/>
-          <w:szCs w:val="26"/>
-        </w:rPr>
-        <w:t>.</w:t>
+        <w:t>1. Lý do chọn đề tài</w:t>
+      </w:r>
+    </w:p>
+    <w:p>
+      <w:pPr>
+        <w:pStyle w:val="10"/>
+        <w:keepNext w:val="0"/>
+        <w:keepLines w:val="0"/>
+        <w:widowControl/>
+        <w:suppressLineNumbers w:val="0"/>
+        <w:rPr>
+          <w:rFonts w:hint="default" w:ascii="Times New Roman" w:hAnsi="Times New Roman" w:cs="Times New Roman"/>
+          <w:sz w:val="26"/>
+          <w:szCs w:val="26"/>
+        </w:rPr>
+      </w:pPr>
+      <w:r>
+        <w:rPr>
+          <w:rFonts w:hint="default" w:ascii="Times New Roman" w:hAnsi="Times New Roman" w:cs="Times New Roman"/>
+          <w:sz w:val="26"/>
+          <w:szCs w:val="26"/>
+        </w:rPr>
+        <w:t xml:space="preserve">Trong kỷ nguyên số, nhu cầu giao tiếp thời gian thực (real-time) như các ứng dụng nhắn tin ngày càng trở nên thiết yếu. Để xây dựng các hệ thống này, giao thức </w:t>
+      </w:r>
+      <w:r>
+        <w:rPr>
+          <w:rFonts w:hint="default" w:ascii="Times New Roman" w:hAnsi="Times New Roman" w:cs="Times New Roman"/>
+          <w:b w:val="0"/>
+          <w:bCs w:val="0"/>
+          <w:sz w:val="26"/>
+          <w:szCs w:val="26"/>
+        </w:rPr>
+        <w:t>TCP (Transmission Control Protocol)</w:t>
+      </w:r>
+      <w:r>
+        <w:rPr>
+          <w:rFonts w:hint="default" w:ascii="Times New Roman" w:hAnsi="Times New Roman" w:cs="Times New Roman"/>
+          <w:sz w:val="26"/>
+          <w:szCs w:val="26"/>
+        </w:rPr>
+        <w:t xml:space="preserve"> là lựa chọn hàng đầu nhờ đặc tính hướng kết nối, đảm bảo dữ liệu được truyền tải một cách tin cậy, chính xác và không bị mất mát.</w:t>
+      </w:r>
+    </w:p>
+    <w:p>
+      <w:pPr>
+        <w:pStyle w:val="10"/>
+        <w:keepNext w:val="0"/>
+        <w:keepLines w:val="0"/>
+        <w:widowControl/>
+        <w:suppressLineNumbers w:val="0"/>
+        <w:rPr>
+          <w:rFonts w:hint="default" w:ascii="Times New Roman" w:hAnsi="Times New Roman" w:cs="Times New Roman"/>
+          <w:b w:val="0"/>
+          <w:bCs w:val="0"/>
+          <w:sz w:val="26"/>
+          <w:szCs w:val="26"/>
+        </w:rPr>
+      </w:pPr>
+      <w:r>
+        <w:rPr>
+          <w:rFonts w:hint="default" w:ascii="Times New Roman" w:hAnsi="Times New Roman" w:cs="Times New Roman"/>
+          <w:sz w:val="26"/>
+          <w:szCs w:val="26"/>
+        </w:rPr>
+        <w:t xml:space="preserve">Môn học Lập trình mạng cung cấp các lý thuyết nền tảng về Socket và kiến trúc Client-Server. Nhằm mục đích chuyển hóa các lý thuyết này thành thực tế, đồng thời giải quyết bài toán xử lý đa luồng (Multi-threading) khi có nhiều người dùng kết nối cùng lúc, em/nhóm em đã quyết định thực hiện đề tài: </w:t>
+      </w:r>
+      <w:r>
+        <w:rPr>
+          <w:rFonts w:hint="default" w:ascii="Times New Roman" w:hAnsi="Times New Roman" w:cs="Times New Roman"/>
+          <w:b w:val="0"/>
+          <w:bCs w:val="0"/>
+          <w:sz w:val="26"/>
+          <w:szCs w:val="26"/>
+        </w:rPr>
+        <w:t>"</w:t>
+      </w:r>
+      <w:r>
+        <w:rPr>
+          <w:rFonts w:hint="default" w:ascii="Times New Roman" w:hAnsi="Times New Roman" w:cs="Times New Roman"/>
+          <w:b w:val="0"/>
+          <w:bCs w:val="0"/>
+          <w:sz w:val="26"/>
+          <w:szCs w:val="26"/>
+          <w:lang w:val="en-US"/>
+        </w:rPr>
+        <w:t>Lập trình</w:t>
+      </w:r>
+      <w:r>
+        <w:rPr>
+          <w:rFonts w:hint="default" w:ascii="Times New Roman" w:hAnsi="Times New Roman" w:cs="Times New Roman"/>
+          <w:b w:val="0"/>
+          <w:bCs w:val="0"/>
+          <w:sz w:val="26"/>
+          <w:szCs w:val="26"/>
+        </w:rPr>
+        <w:t xml:space="preserve"> ứng dụng chat qua giao thức TCP".</w:t>
       </w:r>
     </w:p>
     <w:p>
@@ -1621,17 +1616,17 @@
         <w:suppressLineNumbers w:val="0"/>
         <w:rPr>
           <w:rFonts w:hint="default" w:ascii="Times New Roman" w:hAnsi="Times New Roman" w:cs="Times New Roman"/>
-          <w:b w:val="0"/>
-          <w:bCs w:val="0"/>
-          <w:sz w:val="26"/>
-          <w:szCs w:val="26"/>
-        </w:rPr>
-      </w:pPr>
-      <w:r>
-        <w:rPr>
-          <w:rFonts w:hint="default" w:ascii="Times New Roman" w:hAnsi="Times New Roman" w:cs="Times New Roman"/>
-          <w:b w:val="0"/>
-          <w:bCs w:val="0"/>
+          <w:b/>
+          <w:bCs/>
+          <w:sz w:val="26"/>
+          <w:szCs w:val="26"/>
+        </w:rPr>
+      </w:pPr>
+      <w:r>
+        <w:rPr>
+          <w:rFonts w:hint="default" w:ascii="Times New Roman" w:hAnsi="Times New Roman" w:cs="Times New Roman"/>
+          <w:b/>
+          <w:bCs/>
           <w:sz w:val="26"/>
           <w:szCs w:val="26"/>
         </w:rPr>
@@ -1912,6 +1907,7 @@
         <w:keepLines w:val="0"/>
         <w:widowControl/>
         <w:suppressLineNumbers w:val="0"/>
+        <w:jc w:val="center"/>
         <w:rPr>
           <w:rFonts w:hint="default" w:ascii="Times New Roman" w:hAnsi="Times New Roman" w:cs="Times New Roman"/>
           <w:sz w:val="26"/>
@@ -1948,6 +1944,8 @@
         </w:rPr>
         <w:t>1.1. Tổng quan về ứng dụng Chat TCP</w:t>
       </w:r>
+      <w:bookmarkStart w:id="0" w:name="_GoBack"/>
+      <w:bookmarkEnd w:id="0"/>
     </w:p>
     <w:p>
       <w:pPr>
@@ -5213,54 +5211,99 @@
         <w:keepLines w:val="0"/>
         <w:widowControl/>
         <w:suppressLineNumbers w:val="0"/>
-        <w:rPr>
-          <w:rFonts w:hint="default" w:ascii="Times New Roman" w:hAnsi="Times New Roman" w:cs="Times New Roman"/>
-          <w:b w:val="0"/>
-          <w:bCs w:val="0"/>
-          <w:sz w:val="26"/>
-          <w:szCs w:val="26"/>
-        </w:rPr>
-      </w:pPr>
-      <w:r>
-        <w:rPr>
-          <w:rFonts w:hint="default" w:ascii="Times New Roman" w:hAnsi="Times New Roman" w:cs="Times New Roman"/>
-          <w:b w:val="0"/>
-          <w:bCs w:val="0"/>
-          <w:sz w:val="26"/>
-          <w:szCs w:val="26"/>
-        </w:rPr>
-        <w:t xml:space="preserve">4. KIỂM THỬ HIỆU NĂNG VÀ ĐÁNH GIÁ </w:t>
-      </w:r>
-      <w:bookmarkStart w:id="0" w:name="_GoBack"/>
-      <w:bookmarkEnd w:id="0"/>
-    </w:p>
-    <w:p>
-      <w:pPr>
-        <w:pStyle w:val="10"/>
-        <w:keepNext w:val="0"/>
-        <w:keepLines w:val="0"/>
-        <w:widowControl/>
-        <w:suppressLineNumbers w:val="0"/>
-        <w:ind w:left="720" w:right="720"/>
-        <w:rPr>
-          <w:rFonts w:hint="default" w:ascii="Times New Roman" w:hAnsi="Times New Roman" w:cs="Times New Roman"/>
-          <w:b w:val="0"/>
-          <w:bCs w:val="0"/>
-          <w:sz w:val="26"/>
-          <w:szCs w:val="26"/>
-        </w:rPr>
-      </w:pPr>
-      <w:r>
-        <w:rPr>
-          <w:rFonts w:hint="default" w:ascii="Times New Roman" w:hAnsi="Times New Roman" w:eastAsia="SimSun" w:cs="Times New Roman"/>
-          <w:b w:val="0"/>
-          <w:bCs w:val="0"/>
-          <w:i/>
-          <w:iCs/>
-          <w:sz w:val="26"/>
-          <w:szCs w:val="26"/>
-        </w:rPr>
-        <w:t>Lưu ý quan trọng: Đây là phần bắt buộc phải cung cấp bằng chứng (proof) thực tế cho giảng viên.</w:t>
+        <w:jc w:val="center"/>
+        <w:rPr>
+          <w:rFonts w:hint="default" w:ascii="Times New Roman" w:hAnsi="Times New Roman" w:cs="Times New Roman"/>
+          <w:b w:val="0"/>
+          <w:bCs w:val="0"/>
+          <w:sz w:val="26"/>
+          <w:szCs w:val="26"/>
+        </w:rPr>
+      </w:pPr>
+      <w:r>
+        <w:rPr>
+          <w:rFonts w:hint="default" w:ascii="Times New Roman" w:hAnsi="Times New Roman" w:cs="Times New Roman"/>
+          <w:b w:val="0"/>
+          <w:bCs w:val="0"/>
+          <w:sz w:val="26"/>
+          <w:szCs w:val="26"/>
+          <w:lang w:val="en-US"/>
+        </w:rPr>
+        <w:t xml:space="preserve">CHƯƠNG 3: </w:t>
+      </w:r>
+      <w:r>
+        <w:rPr>
+          <w:rFonts w:hint="default" w:ascii="Times New Roman" w:hAnsi="Times New Roman" w:cs="Times New Roman"/>
+          <w:b w:val="0"/>
+          <w:bCs w:val="0"/>
+          <w:sz w:val="26"/>
+          <w:szCs w:val="26"/>
+        </w:rPr>
+        <w:t>KIỂM THỬ HIỆU NĂNG VÀ ĐÁNH GIÁ</w:t>
+      </w:r>
+    </w:p>
+    <w:p>
+      <w:pPr>
+        <w:pStyle w:val="3"/>
+        <w:keepNext w:val="0"/>
+        <w:keepLines w:val="0"/>
+        <w:widowControl/>
+        <w:suppressLineNumbers w:val="0"/>
+        <w:rPr>
+          <w:rFonts w:hint="default" w:ascii="Times New Roman" w:hAnsi="Times New Roman" w:cs="Times New Roman"/>
+          <w:b w:val="0"/>
+          <w:bCs w:val="0"/>
+          <w:sz w:val="26"/>
+          <w:szCs w:val="26"/>
+        </w:rPr>
+      </w:pPr>
+      <w:r>
+        <w:rPr>
+          <w:rFonts w:hint="default" w:ascii="Times New Roman" w:hAnsi="Times New Roman" w:cs="Times New Roman"/>
+          <w:b w:val="0"/>
+          <w:bCs w:val="0"/>
+          <w:sz w:val="26"/>
+          <w:szCs w:val="26"/>
+          <w:lang w:val="en-US"/>
+        </w:rPr>
+        <w:t>3.1.</w:t>
+      </w:r>
+      <w:r>
+        <w:rPr>
+          <w:rFonts w:hint="default" w:ascii="Times New Roman" w:hAnsi="Times New Roman" w:cs="Times New Roman"/>
+          <w:b w:val="0"/>
+          <w:bCs w:val="0"/>
+          <w:sz w:val="26"/>
+          <w:szCs w:val="26"/>
+        </w:rPr>
+        <w:t xml:space="preserve"> Kịch bản kiểm thử chức năng (Functional Testing)</w:t>
+      </w:r>
+    </w:p>
+    <w:p>
+      <w:pPr>
+        <w:pStyle w:val="10"/>
+        <w:keepNext w:val="0"/>
+        <w:keepLines w:val="0"/>
+        <w:widowControl/>
+        <w:suppressLineNumbers w:val="0"/>
+        <w:ind w:left="720"/>
+        <w:rPr>
+          <w:rFonts w:hint="default" w:ascii="Times New Roman" w:hAnsi="Times New Roman" w:cs="Times New Roman"/>
+          <w:b w:val="0"/>
+          <w:bCs w:val="0"/>
+          <w:sz w:val="26"/>
+          <w:szCs w:val="26"/>
+        </w:rPr>
+      </w:pPr>
+      <w:r>
+        <w:rPr>
+          <w:rFonts w:hint="default" w:ascii="Times New Roman" w:hAnsi="Times New Roman" w:cs="Times New Roman"/>
+          <w:b w:val="0"/>
+          <w:bCs w:val="0"/>
+          <w:sz w:val="26"/>
+          <w:szCs w:val="26"/>
+        </w:rPr>
+        <w:t>Xây dựng bảng kiểm thử (Test Cases) cho tất cả các nhóm chức năng: Xác thực, Chat, Đa phương tiện, Chatbot và Quản trị.</w:t>
       </w:r>
     </w:p>
     <w:p>
@@ -5285,8 +5328,19 @@
           <w:bCs w:val="0"/>
           <w:sz w:val="26"/>
           <w:szCs w:val="26"/>
-        </w:rPr>
-        <w:t>4.1. Kịch bản kiểm thử chức năng (Functional Testing)</w:t>
+          <w:lang w:val="en-US"/>
+        </w:rPr>
+        <w:t>3</w:t>
+      </w:r>
+      <w:r>
+        <w:rPr>
+          <w:rFonts w:hint="default" w:ascii="Times New Roman" w:hAnsi="Times New Roman" w:cs="Times New Roman"/>
+          <w:b w:val="0"/>
+          <w:bCs w:val="0"/>
+          <w:sz w:val="26"/>
+          <w:szCs w:val="26"/>
+        </w:rPr>
+        <w:t>.2. Kiểm thử hiệu năng và độ chịu tải (Stress Test &amp; Performance Test)</w:t>
       </w:r>
     </w:p>
     <w:p>
@@ -5313,7 +5367,119 @@
           <w:sz w:val="26"/>
           <w:szCs w:val="26"/>
         </w:rPr>
-        <w:t>Xây dựng bảng kiểm thử (Test Cases) cho tất cả các nhóm chức năng: Xác thực, Chat, Đa phương tiện, Chatbot và Quản trị.</w:t>
+        <w:t>Phương pháp thực hiện: Sử dụng một đoạn script hoặc chương trình giả lập kết nối (Dummy Clients) để tạo đồng thời 10, 50, và 100 kết nối TCP đồng thời vào Server.</w:t>
+      </w:r>
+    </w:p>
+    <w:p>
+      <w:pPr>
+        <w:pStyle w:val="10"/>
+        <w:keepNext w:val="0"/>
+        <w:keepLines w:val="0"/>
+        <w:widowControl/>
+        <w:suppressLineNumbers w:val="0"/>
+        <w:ind w:left="720"/>
+        <w:rPr>
+          <w:rFonts w:hint="default" w:ascii="Times New Roman" w:hAnsi="Times New Roman" w:cs="Times New Roman"/>
+          <w:b w:val="0"/>
+          <w:bCs w:val="0"/>
+          <w:sz w:val="26"/>
+          <w:szCs w:val="26"/>
+        </w:rPr>
+      </w:pPr>
+      <w:r>
+        <w:rPr>
+          <w:rFonts w:hint="default" w:ascii="Times New Roman" w:hAnsi="Times New Roman" w:cs="Times New Roman"/>
+          <w:b w:val="0"/>
+          <w:bCs w:val="0"/>
+          <w:sz w:val="26"/>
+          <w:szCs w:val="26"/>
+        </w:rPr>
+        <w:t>Bằng chứng thu thập (Proof): * Chụp ảnh màn hình hiệu năng hệ thống (Task Manager / Diagnostic Tools trong Visual Studio) hiển thị mức độ chiếm dụng CPU và RAM của Server khi chịu tải.</w:t>
+      </w:r>
+    </w:p>
+    <w:p>
+      <w:pPr>
+        <w:pStyle w:val="10"/>
+        <w:keepNext w:val="0"/>
+        <w:keepLines w:val="0"/>
+        <w:widowControl/>
+        <w:suppressLineNumbers w:val="0"/>
+        <w:ind w:left="1440"/>
+        <w:rPr>
+          <w:rFonts w:hint="default" w:ascii="Times New Roman" w:hAnsi="Times New Roman" w:cs="Times New Roman"/>
+          <w:b w:val="0"/>
+          <w:bCs w:val="0"/>
+          <w:sz w:val="26"/>
+          <w:szCs w:val="26"/>
+        </w:rPr>
+      </w:pPr>
+      <w:r>
+        <w:rPr>
+          <w:rFonts w:hint="default" w:ascii="Times New Roman" w:hAnsi="Times New Roman" w:cs="Times New Roman"/>
+          <w:b w:val="0"/>
+          <w:bCs w:val="0"/>
+          <w:sz w:val="26"/>
+          <w:szCs w:val="26"/>
+        </w:rPr>
+        <w:t>Biểu đồ hoặc số liệu thống kê về độ trễ tin nhắn, tỷ lệ mất gói tin (nếu có) và tính ổn định của Server khi Client ngắt kết nối đột ngột.</w:t>
+      </w:r>
+    </w:p>
+    <w:p>
+      <w:pPr>
+        <w:rPr>
+          <w:rFonts w:hint="default" w:ascii="Times New Roman" w:hAnsi="Times New Roman" w:cs="Times New Roman"/>
+          <w:b w:val="0"/>
+          <w:bCs w:val="0"/>
+          <w:sz w:val="26"/>
+          <w:szCs w:val="26"/>
+        </w:rPr>
+      </w:pPr>
+      <w:r>
+        <w:rPr>
+          <w:rFonts w:hint="default" w:ascii="Times New Roman" w:hAnsi="Times New Roman" w:cs="Times New Roman"/>
+          <w:b w:val="0"/>
+          <w:bCs w:val="0"/>
+          <w:sz w:val="26"/>
+          <w:szCs w:val="26"/>
+        </w:rPr>
+        <w:br w:type="page"/>
+      </w:r>
+    </w:p>
+    <w:p>
+      <w:pPr>
+        <w:pStyle w:val="3"/>
+        <w:keepNext w:val="0"/>
+        <w:keepLines w:val="0"/>
+        <w:widowControl/>
+        <w:suppressLineNumbers w:val="0"/>
+        <w:rPr>
+          <w:rFonts w:hint="default" w:ascii="Times New Roman" w:hAnsi="Times New Roman" w:cs="Times New Roman"/>
+          <w:b w:val="0"/>
+          <w:bCs w:val="0"/>
+          <w:sz w:val="26"/>
+          <w:szCs w:val="26"/>
+        </w:rPr>
+      </w:pPr>
+      <w:r>
+        <w:rPr>
+          <w:rFonts w:hint="default" w:ascii="Times New Roman" w:hAnsi="Times New Roman" w:cs="Times New Roman"/>
+          <w:b w:val="0"/>
+          <w:bCs w:val="0"/>
+          <w:sz w:val="26"/>
+          <w:szCs w:val="26"/>
+          <w:lang w:val="en-US"/>
+        </w:rPr>
+        <w:t xml:space="preserve">CHƯƠNG 4: </w:t>
+      </w:r>
+      <w:r>
+        <w:rPr>
+          <w:rFonts w:hint="default" w:ascii="Times New Roman" w:hAnsi="Times New Roman" w:cs="Times New Roman"/>
+          <w:b w:val="0"/>
+          <w:bCs w:val="0"/>
+          <w:sz w:val="26"/>
+          <w:szCs w:val="26"/>
+        </w:rPr>
+        <w:t>KẾT LUẬN VÀ HƯỚNG PHÁT TRIỂN</w:t>
       </w:r>
     </w:p>
     <w:p>
@@ -5338,8 +5504,19 @@
           <w:bCs w:val="0"/>
           <w:sz w:val="26"/>
           <w:szCs w:val="26"/>
-        </w:rPr>
-        <w:t>4.2. Kiểm thử hiệu năng và độ chịu tải (Stress Test &amp; Performance Test)</w:t>
+          <w:lang w:val="en-US"/>
+        </w:rPr>
+        <w:t>4</w:t>
+      </w:r>
+      <w:r>
+        <w:rPr>
+          <w:rFonts w:hint="default" w:ascii="Times New Roman" w:hAnsi="Times New Roman" w:cs="Times New Roman"/>
+          <w:b w:val="0"/>
+          <w:bCs w:val="0"/>
+          <w:sz w:val="26"/>
+          <w:szCs w:val="26"/>
+        </w:rPr>
+        <w:t>.1. Kết quả dự án đạt được</w:t>
       </w:r>
     </w:p>
     <w:p>
@@ -5366,7 +5543,44 @@
           <w:sz w:val="26"/>
           <w:szCs w:val="26"/>
         </w:rPr>
-        <w:t>Phương pháp thực hiện: Sử dụng một đoạn script hoặc chương trình giả lập kết nối (Dummy Clients) để tạo đồng thời 10, 50, và 100 kết nối TCP đồng thời vào Server.</w:t>
+        <w:t>Đối chiếu lại với mục tiêu ban đầu: Đã hoàn thiện giao diện GUI trực quan, hệ thống chạy mượt mà, phân quyền Admin chính xác và tích hợp Chatbot phản hồi nhanh chóng.</w:t>
+      </w:r>
+    </w:p>
+    <w:p>
+      <w:pPr>
+        <w:pStyle w:val="4"/>
+        <w:keepNext w:val="0"/>
+        <w:keepLines w:val="0"/>
+        <w:widowControl/>
+        <w:suppressLineNumbers w:val="0"/>
+        <w:rPr>
+          <w:rFonts w:hint="default" w:ascii="Times New Roman" w:hAnsi="Times New Roman" w:cs="Times New Roman"/>
+          <w:b w:val="0"/>
+          <w:bCs w:val="0"/>
+          <w:sz w:val="26"/>
+          <w:szCs w:val="26"/>
+        </w:rPr>
+      </w:pPr>
+      <w:r>
+        <w:rPr>
+          <w:rFonts w:hint="default" w:ascii="Times New Roman" w:hAnsi="Times New Roman" w:cs="Times New Roman"/>
+          <w:b w:val="0"/>
+          <w:bCs w:val="0"/>
+          <w:sz w:val="26"/>
+          <w:szCs w:val="26"/>
+          <w:lang w:val="en-US"/>
+        </w:rPr>
+        <w:t>4</w:t>
+      </w:r>
+      <w:r>
+        <w:rPr>
+          <w:rFonts w:hint="default" w:ascii="Times New Roman" w:hAnsi="Times New Roman" w:cs="Times New Roman"/>
+          <w:b w:val="0"/>
+          <w:bCs w:val="0"/>
+          <w:sz w:val="26"/>
+          <w:szCs w:val="26"/>
+        </w:rPr>
+        <w:t>.2. Hạn chế còn tồn tại</w:t>
       </w:r>
     </w:p>
     <w:p>
@@ -5393,81 +5607,7 @@
           <w:sz w:val="26"/>
           <w:szCs w:val="26"/>
         </w:rPr>
-        <w:t>Bằng chứng thu thập (Proof): * Chụp ảnh màn hình hiệu năng hệ thống (Task Manager / Diagnostic Tools trong Visual Studio) hiển thị mức độ chiếm dụng CPU và RAM của Server khi chịu tải.</w:t>
-      </w:r>
-    </w:p>
-    <w:p>
-      <w:pPr>
-        <w:pStyle w:val="10"/>
-        <w:keepNext w:val="0"/>
-        <w:keepLines w:val="0"/>
-        <w:widowControl/>
-        <w:suppressLineNumbers w:val="0"/>
-        <w:ind w:left="1440"/>
-        <w:rPr>
-          <w:rFonts w:hint="default" w:ascii="Times New Roman" w:hAnsi="Times New Roman" w:cs="Times New Roman"/>
-          <w:b w:val="0"/>
-          <w:bCs w:val="0"/>
-          <w:sz w:val="26"/>
-          <w:szCs w:val="26"/>
-        </w:rPr>
-      </w:pPr>
-      <w:r>
-        <w:rPr>
-          <w:rFonts w:hint="default" w:ascii="Times New Roman" w:hAnsi="Times New Roman" w:cs="Times New Roman"/>
-          <w:b w:val="0"/>
-          <w:bCs w:val="0"/>
-          <w:sz w:val="26"/>
-          <w:szCs w:val="26"/>
-        </w:rPr>
-        <w:t>Biểu đồ hoặc số liệu thống kê về độ trễ tin nhắn, tỷ lệ mất gói tin (nếu có) và tính ổn định của Server khi Client ngắt kết nối đột ngột.</w:t>
-      </w:r>
-    </w:p>
-    <w:p>
-      <w:pPr>
-        <w:rPr>
-          <w:rFonts w:hint="default" w:ascii="Times New Roman" w:hAnsi="Times New Roman" w:cs="Times New Roman"/>
-          <w:b w:val="0"/>
-          <w:bCs w:val="0"/>
-          <w:sz w:val="26"/>
-          <w:szCs w:val="26"/>
-        </w:rPr>
-      </w:pPr>
-      <w:r>
-        <w:rPr>
-          <w:rFonts w:hint="default" w:ascii="Times New Roman" w:hAnsi="Times New Roman" w:cs="Times New Roman"/>
-          <w:b w:val="0"/>
-          <w:bCs w:val="0"/>
-          <w:sz w:val="26"/>
-          <w:szCs w:val="26"/>
-        </w:rPr>
-        <w:br w:type="page"/>
-      </w:r>
-    </w:p>
-    <w:p>
-      <w:pPr>
-        <w:pStyle w:val="3"/>
-        <w:keepNext w:val="0"/>
-        <w:keepLines w:val="0"/>
-        <w:widowControl/>
-        <w:suppressLineNumbers w:val="0"/>
-        <w:rPr>
-          <w:rFonts w:hint="default" w:ascii="Times New Roman" w:hAnsi="Times New Roman" w:cs="Times New Roman"/>
-          <w:b w:val="0"/>
-          <w:bCs w:val="0"/>
-          <w:sz w:val="26"/>
-          <w:szCs w:val="26"/>
-        </w:rPr>
-      </w:pPr>
-      <w:r>
-        <w:rPr>
-          <w:rFonts w:hint="default" w:ascii="Times New Roman" w:hAnsi="Times New Roman" w:cs="Times New Roman"/>
-          <w:b w:val="0"/>
-          <w:bCs w:val="0"/>
-          <w:sz w:val="26"/>
-          <w:szCs w:val="26"/>
-        </w:rPr>
-        <w:t>5. KẾT LUẬN VÀ HƯỚNG PHÁT TRIỂN</w:t>
+        <w:t>Ví dụ: Hệ thống truyền file dung lượng quá lớn đôi khi làm tăng độ trễ; giao diện Chatbot chưa tự học được (chỉ dựa trên tập quy tắc từ khóa cố định).</w:t>
       </w:r>
     </w:p>
     <w:p>
@@ -5492,114 +5632,19 @@
           <w:bCs w:val="0"/>
           <w:sz w:val="26"/>
           <w:szCs w:val="26"/>
-        </w:rPr>
-        <w:t>5.1. Kết quả dự án đạt được</w:t>
-      </w:r>
-    </w:p>
-    <w:p>
-      <w:pPr>
-        <w:pStyle w:val="10"/>
-        <w:keepNext w:val="0"/>
-        <w:keepLines w:val="0"/>
-        <w:widowControl/>
-        <w:suppressLineNumbers w:val="0"/>
-        <w:ind w:left="720"/>
-        <w:rPr>
-          <w:rFonts w:hint="default" w:ascii="Times New Roman" w:hAnsi="Times New Roman" w:cs="Times New Roman"/>
-          <w:b w:val="0"/>
-          <w:bCs w:val="0"/>
-          <w:sz w:val="26"/>
-          <w:szCs w:val="26"/>
-        </w:rPr>
-      </w:pPr>
-      <w:r>
-        <w:rPr>
-          <w:rFonts w:hint="default" w:ascii="Times New Roman" w:hAnsi="Times New Roman" w:cs="Times New Roman"/>
-          <w:b w:val="0"/>
-          <w:bCs w:val="0"/>
-          <w:sz w:val="26"/>
-          <w:szCs w:val="26"/>
-        </w:rPr>
-        <w:t>Đối chiếu lại với mục tiêu ban đầu: Đã hoàn thiện giao diện GUI trực quan, hệ thống chạy mượt mà, phân quyền Admin chính xác và tích hợp Chatbot phản hồi nhanh chóng.</w:t>
-      </w:r>
-    </w:p>
-    <w:p>
-      <w:pPr>
-        <w:pStyle w:val="4"/>
-        <w:keepNext w:val="0"/>
-        <w:keepLines w:val="0"/>
-        <w:widowControl/>
-        <w:suppressLineNumbers w:val="0"/>
-        <w:rPr>
-          <w:rFonts w:hint="default" w:ascii="Times New Roman" w:hAnsi="Times New Roman" w:cs="Times New Roman"/>
-          <w:b w:val="0"/>
-          <w:bCs w:val="0"/>
-          <w:sz w:val="26"/>
-          <w:szCs w:val="26"/>
-        </w:rPr>
-      </w:pPr>
-      <w:r>
-        <w:rPr>
-          <w:rFonts w:hint="default" w:ascii="Times New Roman" w:hAnsi="Times New Roman" w:cs="Times New Roman"/>
-          <w:b w:val="0"/>
-          <w:bCs w:val="0"/>
-          <w:sz w:val="26"/>
-          <w:szCs w:val="26"/>
-        </w:rPr>
-        <w:t>5.2. Hạn chế còn tồn tại</w:t>
-      </w:r>
-    </w:p>
-    <w:p>
-      <w:pPr>
-        <w:pStyle w:val="10"/>
-        <w:keepNext w:val="0"/>
-        <w:keepLines w:val="0"/>
-        <w:widowControl/>
-        <w:suppressLineNumbers w:val="0"/>
-        <w:ind w:left="720"/>
-        <w:rPr>
-          <w:rFonts w:hint="default" w:ascii="Times New Roman" w:hAnsi="Times New Roman" w:cs="Times New Roman"/>
-          <w:b w:val="0"/>
-          <w:bCs w:val="0"/>
-          <w:sz w:val="26"/>
-          <w:szCs w:val="26"/>
-        </w:rPr>
-      </w:pPr>
-      <w:r>
-        <w:rPr>
-          <w:rFonts w:hint="default" w:ascii="Times New Roman" w:hAnsi="Times New Roman" w:cs="Times New Roman"/>
-          <w:b w:val="0"/>
-          <w:bCs w:val="0"/>
-          <w:sz w:val="26"/>
-          <w:szCs w:val="26"/>
-        </w:rPr>
-        <w:t>Ví dụ: Hệ thống truyền file dung lượng quá lớn đôi khi làm tăng độ trễ; giao diện Chatbot chưa tự học được (chỉ dựa trên tập quy tắc từ khóa cố định).</w:t>
-      </w:r>
-    </w:p>
-    <w:p>
-      <w:pPr>
-        <w:pStyle w:val="4"/>
-        <w:keepNext w:val="0"/>
-        <w:keepLines w:val="0"/>
-        <w:widowControl/>
-        <w:suppressLineNumbers w:val="0"/>
-        <w:rPr>
-          <w:rFonts w:hint="default" w:ascii="Times New Roman" w:hAnsi="Times New Roman" w:cs="Times New Roman"/>
-          <w:b w:val="0"/>
-          <w:bCs w:val="0"/>
-          <w:sz w:val="26"/>
-          <w:szCs w:val="26"/>
-        </w:rPr>
-      </w:pPr>
-      <w:r>
-        <w:rPr>
-          <w:rFonts w:hint="default" w:ascii="Times New Roman" w:hAnsi="Times New Roman" w:cs="Times New Roman"/>
-          <w:b w:val="0"/>
-          <w:bCs w:val="0"/>
-          <w:sz w:val="26"/>
-          <w:szCs w:val="26"/>
-        </w:rPr>
-        <w:t>5.3. Hướng phát triển tương lai</w:t>
+          <w:lang w:val="en-US"/>
+        </w:rPr>
+        <w:t>4</w:t>
+      </w:r>
+      <w:r>
+        <w:rPr>
+          <w:rFonts w:hint="default" w:ascii="Times New Roman" w:hAnsi="Times New Roman" w:cs="Times New Roman"/>
+          <w:b w:val="0"/>
+          <w:bCs w:val="0"/>
+          <w:sz w:val="26"/>
+          <w:szCs w:val="26"/>
+        </w:rPr>
+        <w:t>.3. Hướng phát triển tương lai</w:t>
       </w:r>
     </w:p>
     <w:p>
@@ -5798,7 +5843,7 @@
     <w:lsdException w:qFormat="1" w:unhideWhenUsed="0" w:uiPriority="0" w:semiHidden="0" w:name="HTML Code"/>
     <w:lsdException w:unhideWhenUsed="0" w:uiPriority="0" w:semiHidden="0" w:name="HTML Definition"/>
     <w:lsdException w:unhideWhenUsed="0" w:uiPriority="0" w:semiHidden="0" w:name="HTML Keyboard"/>
-    <w:lsdException w:unhideWhenUsed="0" w:uiPriority="0" w:semiHidden="0" w:name="HTML Preformatted"/>
+    <w:lsdException w:qFormat="1" w:unhideWhenUsed="0" w:uiPriority="0" w:semiHidden="0" w:name="HTML Preformatted"/>
     <w:lsdException w:unhideWhenUsed="0" w:uiPriority="0" w:semiHidden="0" w:name="HTML Sample"/>
     <w:lsdException w:unhideWhenUsed="0" w:uiPriority="0" w:semiHidden="0" w:name="HTML Typewriter"/>
     <w:lsdException w:unhideWhenUsed="0" w:uiPriority="0" w:semiHidden="0" w:name="HTML Variable"/>
@@ -6072,6 +6117,7 @@
   </w:style>
   <w:style w:type="paragraph" w:styleId="9">
     <w:name w:val="HTML Preformatted"/>
+    <w:qFormat/>
     <w:uiPriority w:val="0"/>
     <w:pPr>
       <w:tabs>

</xml_diff>